<commit_message>
chore: Remove legacy ui/ directory and Streamlit code as primary frontend is now React Vite SPA
</commit_message>
<xml_diff>
--- a/Some Concept.docx
+++ b/Some Concept.docx
@@ -1488,78 +1488,325 @@
           <w:lang w:val="en-US"/>
         </w:rPr>
       </w:pPr>
+    </w:p>
+    <w:p>
+      <w:pPr>
+        <w:tabs>
+          <w:tab w:val="left" w:pos="1605"/>
+        </w:tabs>
+        <w:rPr>
+          <w:rFonts w:ascii="Arial" w:hAnsi="Arial" w:cs="Arial"/>
+          <w:b/>
+          <w:color w:val="FF0000"/>
+          <w:sz w:val="28"/>
+          <w:lang w:val="en-US"/>
+        </w:rPr>
+      </w:pPr>
+      <w:r>
+        <w:rPr>
+          <w:rFonts w:ascii="Arial" w:hAnsi="Arial" w:cs="Arial"/>
+          <w:b/>
+          <w:color w:val="FF0000"/>
+          <w:sz w:val="28"/>
+          <w:lang w:val="en-US"/>
+        </w:rPr>
+        <w:lastRenderedPageBreak/>
+        <w:drawing>
+          <wp:inline distT="0" distB="0" distL="0" distR="0" wp14:anchorId="310FAD7E" wp14:editId="2884FB42">
+            <wp:extent cx="5731510" cy="1881505"/>
+            <wp:effectExtent l="0" t="0" r="2540" b="4445"/>
+            <wp:docPr id="7" name="Picture 7"/>
+            <wp:cNvGraphicFramePr>
+              <a:graphicFrameLocks xmlns:a="http://schemas.openxmlformats.org/drawingml/2006/main" noChangeAspect="1"/>
+            </wp:cNvGraphicFramePr>
+            <a:graphic xmlns:a="http://schemas.openxmlformats.org/drawingml/2006/main">
+              <a:graphicData uri="http://schemas.openxmlformats.org/drawingml/2006/picture">
+                <pic:pic xmlns:pic="http://schemas.openxmlformats.org/drawingml/2006/picture">
+                  <pic:nvPicPr>
+                    <pic:cNvPr id="1" name=""/>
+                    <pic:cNvPicPr/>
+                  </pic:nvPicPr>
+                  <pic:blipFill>
+                    <a:blip r:embed="rId13"/>
+                    <a:stretch>
+                      <a:fillRect/>
+                    </a:stretch>
+                  </pic:blipFill>
+                  <pic:spPr>
+                    <a:xfrm>
+                      <a:off x="0" y="0"/>
+                      <a:ext cx="5731510" cy="1881505"/>
+                    </a:xfrm>
+                    <a:prstGeom prst="rect">
+                      <a:avLst/>
+                    </a:prstGeom>
+                  </pic:spPr>
+                </pic:pic>
+              </a:graphicData>
+            </a:graphic>
+          </wp:inline>
+        </w:drawing>
+      </w:r>
+    </w:p>
+    <w:p>
+      <w:pPr>
+        <w:tabs>
+          <w:tab w:val="left" w:pos="1605"/>
+        </w:tabs>
+        <w:rPr>
+          <w:rFonts w:ascii="Arial" w:hAnsi="Arial" w:cs="Arial"/>
+          <w:b/>
+          <w:color w:val="FF0000"/>
+          <w:sz w:val="28"/>
+          <w:lang w:val="en-US"/>
+        </w:rPr>
+      </w:pPr>
+    </w:p>
+    <w:p>
+      <w:pPr>
+        <w:tabs>
+          <w:tab w:val="left" w:pos="1605"/>
+        </w:tabs>
+        <w:rPr>
+          <w:rFonts w:ascii="Arial" w:hAnsi="Arial" w:cs="Arial"/>
+          <w:b/>
+          <w:color w:val="FF0000"/>
+          <w:sz w:val="28"/>
+          <w:lang w:val="en-US"/>
+        </w:rPr>
+      </w:pPr>
+      <w:r>
+        <w:rPr>
+          <w:rFonts w:ascii="Arial" w:hAnsi="Arial" w:cs="Arial"/>
+          <w:b/>
+          <w:color w:val="FF0000"/>
+          <w:sz w:val="28"/>
+          <w:lang w:val="en-US"/>
+        </w:rPr>
+        <w:drawing>
+          <wp:inline distT="0" distB="0" distL="0" distR="0" wp14:anchorId="431C7B21" wp14:editId="2F214A34">
+            <wp:extent cx="5731510" cy="4078605"/>
+            <wp:effectExtent l="0" t="0" r="2540" b="0"/>
+            <wp:docPr id="8" name="Picture 8"/>
+            <wp:cNvGraphicFramePr>
+              <a:graphicFrameLocks xmlns:a="http://schemas.openxmlformats.org/drawingml/2006/main" noChangeAspect="1"/>
+            </wp:cNvGraphicFramePr>
+            <a:graphic xmlns:a="http://schemas.openxmlformats.org/drawingml/2006/main">
+              <a:graphicData uri="http://schemas.openxmlformats.org/drawingml/2006/picture">
+                <pic:pic xmlns:pic="http://schemas.openxmlformats.org/drawingml/2006/picture">
+                  <pic:nvPicPr>
+                    <pic:cNvPr id="1" name=""/>
+                    <pic:cNvPicPr/>
+                  </pic:nvPicPr>
+                  <pic:blipFill>
+                    <a:blip r:embed="rId14"/>
+                    <a:stretch>
+                      <a:fillRect/>
+                    </a:stretch>
+                  </pic:blipFill>
+                  <pic:spPr>
+                    <a:xfrm>
+                      <a:off x="0" y="0"/>
+                      <a:ext cx="5731510" cy="4078605"/>
+                    </a:xfrm>
+                    <a:prstGeom prst="rect">
+                      <a:avLst/>
+                    </a:prstGeom>
+                  </pic:spPr>
+                </pic:pic>
+              </a:graphicData>
+            </a:graphic>
+          </wp:inline>
+        </w:drawing>
+      </w:r>
+    </w:p>
+    <w:p>
+      <w:pPr>
+        <w:tabs>
+          <w:tab w:val="left" w:pos="1605"/>
+        </w:tabs>
+        <w:rPr>
+          <w:rFonts w:ascii="Arial" w:hAnsi="Arial" w:cs="Arial"/>
+          <w:b/>
+          <w:color w:val="FF0000"/>
+          <w:sz w:val="28"/>
+          <w:lang w:val="en-US"/>
+        </w:rPr>
+      </w:pPr>
+    </w:p>
+    <w:p>
+      <w:pPr>
+        <w:tabs>
+          <w:tab w:val="left" w:pos="1605"/>
+        </w:tabs>
+        <w:rPr>
+          <w:rFonts w:ascii="Arial" w:hAnsi="Arial" w:cs="Arial"/>
+          <w:b/>
+          <w:color w:val="FF0000"/>
+          <w:sz w:val="28"/>
+          <w:lang w:val="en-US"/>
+        </w:rPr>
+      </w:pPr>
+    </w:p>
+    <w:p>
+      <w:pPr>
+        <w:tabs>
+          <w:tab w:val="left" w:pos="1605"/>
+        </w:tabs>
+        <w:rPr>
+          <w:rFonts w:ascii="Arial" w:hAnsi="Arial" w:cs="Arial"/>
+          <w:b/>
+          <w:color w:val="FF0000"/>
+          <w:sz w:val="28"/>
+          <w:lang w:val="en-US"/>
+        </w:rPr>
+      </w:pPr>
+    </w:p>
+    <w:p>
+      <w:pPr>
+        <w:tabs>
+          <w:tab w:val="left" w:pos="1605"/>
+        </w:tabs>
+        <w:rPr>
+          <w:rFonts w:ascii="Arial" w:hAnsi="Arial" w:cs="Arial"/>
+          <w:b/>
+          <w:color w:val="FF0000"/>
+          <w:sz w:val="28"/>
+          <w:lang w:val="en-US"/>
+        </w:rPr>
+      </w:pPr>
+    </w:p>
+    <w:p>
+      <w:pPr>
+        <w:tabs>
+          <w:tab w:val="left" w:pos="1605"/>
+        </w:tabs>
+        <w:rPr>
+          <w:rFonts w:ascii="Arial" w:hAnsi="Arial" w:cs="Arial"/>
+          <w:b/>
+          <w:color w:val="FF0000"/>
+          <w:sz w:val="28"/>
+          <w:lang w:val="en-US"/>
+        </w:rPr>
+      </w:pPr>
+    </w:p>
+    <w:p>
+      <w:pPr>
+        <w:tabs>
+          <w:tab w:val="left" w:pos="1605"/>
+        </w:tabs>
+        <w:rPr>
+          <w:rFonts w:ascii="Arial" w:hAnsi="Arial" w:cs="Arial"/>
+          <w:b/>
+          <w:color w:val="FF0000"/>
+          <w:sz w:val="28"/>
+          <w:lang w:val="en-US"/>
+        </w:rPr>
+      </w:pPr>
+    </w:p>
+    <w:p>
+      <w:pPr>
+        <w:tabs>
+          <w:tab w:val="left" w:pos="1605"/>
+        </w:tabs>
+        <w:rPr>
+          <w:rFonts w:ascii="Arial" w:hAnsi="Arial" w:cs="Arial"/>
+          <w:b/>
+          <w:color w:val="FF0000"/>
+          <w:sz w:val="28"/>
+          <w:lang w:val="en-US"/>
+        </w:rPr>
+      </w:pPr>
+    </w:p>
+    <w:p>
+      <w:pPr>
+        <w:pStyle w:val="ListParagraph"/>
+        <w:numPr>
+          <w:ilvl w:val="0"/>
+          <w:numId w:val="2"/>
+        </w:numPr>
+        <w:tabs>
+          <w:tab w:val="left" w:pos="1605"/>
+        </w:tabs>
+        <w:rPr>
+          <w:rFonts w:ascii="Arial" w:hAnsi="Arial" w:cs="Arial"/>
+          <w:b/>
+          <w:color w:val="FF0000"/>
+          <w:sz w:val="28"/>
+          <w:lang w:val="en-US"/>
+        </w:rPr>
+      </w:pPr>
+      <w:r>
+        <w:rPr>
+          <w:rFonts w:ascii="Arial" w:hAnsi="Arial" w:cs="Arial"/>
+          <w:b/>
+          <w:color w:val="FF0000"/>
+          <w:sz w:val="28"/>
+          <w:lang w:val="en-US"/>
+        </w:rPr>
+        <w:lastRenderedPageBreak/>
+        <w:t>Harness Engineering</w:t>
+      </w:r>
+    </w:p>
+    <w:p>
+      <w:pPr>
+        <w:tabs>
+          <w:tab w:val="left" w:pos="1605"/>
+        </w:tabs>
+        <w:rPr>
+          <w:rFonts w:ascii="Arial" w:hAnsi="Arial" w:cs="Arial"/>
+          <w:b/>
+          <w:color w:val="FF0000"/>
+          <w:sz w:val="28"/>
+          <w:lang w:val="en-US"/>
+        </w:rPr>
+      </w:pPr>
+      <w:r>
+        <w:rPr>
+          <w:rFonts w:ascii="Arial" w:hAnsi="Arial" w:cs="Arial"/>
+          <w:b/>
+          <w:color w:val="FF0000"/>
+          <w:sz w:val="28"/>
+          <w:lang w:val="en-US"/>
+        </w:rPr>
+        <w:drawing>
+          <wp:inline distT="0" distB="0" distL="0" distR="0" wp14:anchorId="67CF3B28" wp14:editId="70366A3A">
+            <wp:extent cx="3381847" cy="4639322"/>
+            <wp:effectExtent l="0" t="0" r="9525" b="0"/>
+            <wp:docPr id="9" name="Picture 9"/>
+            <wp:cNvGraphicFramePr>
+              <a:graphicFrameLocks xmlns:a="http://schemas.openxmlformats.org/drawingml/2006/main" noChangeAspect="1"/>
+            </wp:cNvGraphicFramePr>
+            <a:graphic xmlns:a="http://schemas.openxmlformats.org/drawingml/2006/main">
+              <a:graphicData uri="http://schemas.openxmlformats.org/drawingml/2006/picture">
+                <pic:pic xmlns:pic="http://schemas.openxmlformats.org/drawingml/2006/picture">
+                  <pic:nvPicPr>
+                    <pic:cNvPr id="1" name=""/>
+                    <pic:cNvPicPr/>
+                  </pic:nvPicPr>
+                  <pic:blipFill>
+                    <a:blip r:embed="rId15"/>
+                    <a:stretch>
+                      <a:fillRect/>
+                    </a:stretch>
+                  </pic:blipFill>
+                  <pic:spPr>
+                    <a:xfrm>
+                      <a:off x="0" y="0"/>
+                      <a:ext cx="3381847" cy="4639322"/>
+                    </a:xfrm>
+                    <a:prstGeom prst="rect">
+                      <a:avLst/>
+                    </a:prstGeom>
+                  </pic:spPr>
+                </pic:pic>
+              </a:graphicData>
+            </a:graphic>
+          </wp:inline>
+        </w:drawing>
+      </w:r>
       <w:bookmarkStart w:id="0" w:name="_GoBack"/>
       <w:bookmarkEnd w:id="0"/>
-    </w:p>
-    <w:p>
-      <w:pPr>
-        <w:tabs>
-          <w:tab w:val="left" w:pos="1605"/>
-        </w:tabs>
-        <w:rPr>
-          <w:rFonts w:ascii="Arial" w:hAnsi="Arial" w:cs="Arial"/>
-          <w:b/>
-          <w:color w:val="FF0000"/>
-          <w:sz w:val="28"/>
-          <w:lang w:val="en-US"/>
-        </w:rPr>
-      </w:pPr>
-    </w:p>
-    <w:p>
-      <w:pPr>
-        <w:tabs>
-          <w:tab w:val="left" w:pos="1605"/>
-        </w:tabs>
-        <w:rPr>
-          <w:rFonts w:ascii="Arial" w:hAnsi="Arial" w:cs="Arial"/>
-          <w:b/>
-          <w:color w:val="FF0000"/>
-          <w:sz w:val="28"/>
-          <w:lang w:val="en-US"/>
-        </w:rPr>
-      </w:pPr>
-    </w:p>
-    <w:p>
-      <w:pPr>
-        <w:tabs>
-          <w:tab w:val="left" w:pos="1605"/>
-        </w:tabs>
-        <w:rPr>
-          <w:rFonts w:ascii="Arial" w:hAnsi="Arial" w:cs="Arial"/>
-          <w:b/>
-          <w:color w:val="FF0000"/>
-          <w:sz w:val="28"/>
-          <w:lang w:val="en-US"/>
-        </w:rPr>
-      </w:pPr>
-    </w:p>
-    <w:p>
-      <w:pPr>
-        <w:tabs>
-          <w:tab w:val="left" w:pos="1605"/>
-        </w:tabs>
-        <w:rPr>
-          <w:rFonts w:ascii="Arial" w:hAnsi="Arial" w:cs="Arial"/>
-          <w:b/>
-          <w:color w:val="FF0000"/>
-          <w:sz w:val="28"/>
-          <w:lang w:val="en-US"/>
-        </w:rPr>
-      </w:pPr>
-    </w:p>
-    <w:p>
-      <w:pPr>
-        <w:tabs>
-          <w:tab w:val="left" w:pos="1605"/>
-        </w:tabs>
-        <w:rPr>
-          <w:rFonts w:ascii="Arial" w:hAnsi="Arial" w:cs="Arial"/>
-          <w:b/>
-          <w:color w:val="FF0000"/>
-          <w:sz w:val="28"/>
-          <w:lang w:val="en-US"/>
-        </w:rPr>
-      </w:pPr>
     </w:p>
     <w:p>
       <w:pPr>
@@ -1740,7 +1987,7 @@
   <w:abstractNum w:abstractNumId="1">
     <w:nsid w:val="33323FA6"/>
     <w:multiLevelType w:val="hybridMultilevel"/>
-    <w:tmpl w:val="9F5E89B2"/>
+    <w:tmpl w:val="658AC6EA"/>
     <w:lvl w:ilvl="0" w:tplc="40090009">
       <w:start w:val="1"/>
       <w:numFmt w:val="bullet"/>

</xml_diff>